<commit_message>
Maintainer Guide v2: add Section 3.6 Railway deployment
Covers: Railway services (web + MySQL plugin), all env vars with
purpose (MYSQLHOST/USER/PASSWORD, ADMIN_SECRET, FLASK_SECRET_KEY,
Reddit), health check config (path + 600s timeout), restart policy
(On Failure, retry 5), Serverless OFF warning, deploy workflow
(git push auto-triggers), log viewing, and backup procedure.

Co-Authored-By: Claude Sonnet 4.6 <noreply@anthropic.com>
</commit_message>
<xml_diff>
--- a/SP500_Maintainer_Guide_2026-05-31_v2.docx
+++ b/SP500_Maintainer_Guide_2026-05-31_v2.docx
@@ -10089,6 +10089,515 @@
       </w:tr>
     </w:tbl>
     <w:p/>
+    <w:p>
+      <w:r>
+        <w:rPr>
+          <w:b w:val="0"/>
+        </w:rPr>
+      </w:r>
+    </w:p>
+    <w:p>
+      <w:r>
+        <w:rPr>
+          <w:b/>
+        </w:rPr>
+        <w:t>3.6  Railway (Cloud) Deployment</w:t>
+      </w:r>
+    </w:p>
+    <w:p>
+      <w:r>
+        <w:rPr>
+          <w:b w:val="0"/>
+        </w:rPr>
+        <w:t>The app is deployed on Railway at https://sp500-production-ba63.up.railway.app. Railway auto-deploys whenever code is pushed to the main branch on GitHub.</w:t>
+      </w:r>
+    </w:p>
+    <w:p>
+      <w:r>
+        <w:rPr>
+          <w:b/>
+        </w:rPr>
+        <w:t>Services on Railway</w:t>
+      </w:r>
+    </w:p>
+    <w:p>
+      <w:r>
+        <w:rPr>
+          <w:b w:val="0"/>
+        </w:rPr>
+        <w:t>1. Web service  — Flask app (Gunicorn, 1 worker, 8 threads, 120s timeout)</w:t>
+        <w:br/>
+        <w:t>2. MySQL plugin — managed MySQL 8.x (connection details injected as env vars automatically)</w:t>
+      </w:r>
+    </w:p>
+    <w:p>
+      <w:r>
+        <w:rPr>
+          <w:b/>
+        </w:rPr>
+        <w:t>Environment Variables  (Railway → Service → Variables)</w:t>
+      </w:r>
+    </w:p>
+    <w:tbl>
+      <w:tblPr>
+        <w:tblStyle w:val="TableGrid"/>
+        <w:tblW w:type="auto" w:w="0"/>
+        <w:tblLook w:firstColumn="1" w:firstRow="1" w:lastColumn="0" w:lastRow="0" w:noHBand="0" w:noVBand="1" w:val="04A0"/>
+      </w:tblPr>
+      <w:tblGrid>
+        <w:gridCol w:w="3135"/>
+        <w:gridCol w:w="3135"/>
+        <w:gridCol w:w="3135"/>
+      </w:tblGrid>
+      <w:tr>
+        <w:tc>
+          <w:tcPr>
+            <w:tcW w:type="dxa" w:w="3135"/>
+          </w:tcPr>
+          <w:p>
+            <w:r>
+              <w:t>Variable</w:t>
+            </w:r>
+          </w:p>
+        </w:tc>
+        <w:tc>
+          <w:tcPr>
+            <w:tcW w:type="dxa" w:w="3135"/>
+          </w:tcPr>
+          <w:p>
+            <w:r>
+              <w:t>Value</w:t>
+            </w:r>
+          </w:p>
+        </w:tc>
+        <w:tc>
+          <w:tcPr>
+            <w:tcW w:type="dxa" w:w="3135"/>
+          </w:tcPr>
+          <w:p>
+            <w:r>
+              <w:t>Purpose</w:t>
+            </w:r>
+          </w:p>
+        </w:tc>
+      </w:tr>
+      <w:tr>
+        <w:tc>
+          <w:tcPr>
+            <w:tcW w:type="dxa" w:w="3135"/>
+          </w:tcPr>
+          <w:p>
+            <w:r>
+              <w:t>MYSQLHOST</w:t>
+            </w:r>
+          </w:p>
+        </w:tc>
+        <w:tc>
+          <w:tcPr>
+            <w:tcW w:type="dxa" w:w="3135"/>
+          </w:tcPr>
+          <w:p>
+            <w:r>
+              <w:t>Auto-set by Railway MySQL plugin</w:t>
+            </w:r>
+          </w:p>
+        </w:tc>
+        <w:tc>
+          <w:tcPr>
+            <w:tcW w:type="dxa" w:w="3135"/>
+          </w:tcPr>
+          <w:p>
+            <w:r>
+              <w:t>Database host</w:t>
+            </w:r>
+          </w:p>
+        </w:tc>
+      </w:tr>
+      <w:tr>
+        <w:tc>
+          <w:tcPr>
+            <w:tcW w:type="dxa" w:w="3135"/>
+          </w:tcPr>
+          <w:p>
+            <w:r>
+              <w:t>MYSQLPORT</w:t>
+            </w:r>
+          </w:p>
+        </w:tc>
+        <w:tc>
+          <w:tcPr>
+            <w:tcW w:type="dxa" w:w="3135"/>
+          </w:tcPr>
+          <w:p>
+            <w:r>
+              <w:t>Auto-set by Railway MySQL plugin</w:t>
+            </w:r>
+          </w:p>
+        </w:tc>
+        <w:tc>
+          <w:tcPr>
+            <w:tcW w:type="dxa" w:w="3135"/>
+          </w:tcPr>
+          <w:p>
+            <w:r>
+              <w:t>Database port</w:t>
+            </w:r>
+          </w:p>
+        </w:tc>
+      </w:tr>
+      <w:tr>
+        <w:tc>
+          <w:tcPr>
+            <w:tcW w:type="dxa" w:w="3135"/>
+          </w:tcPr>
+          <w:p>
+            <w:r>
+              <w:t>MYSQLUSER</w:t>
+            </w:r>
+          </w:p>
+        </w:tc>
+        <w:tc>
+          <w:tcPr>
+            <w:tcW w:type="dxa" w:w="3135"/>
+          </w:tcPr>
+          <w:p>
+            <w:r>
+              <w:t>Auto-set by Railway MySQL plugin</w:t>
+            </w:r>
+          </w:p>
+        </w:tc>
+        <w:tc>
+          <w:tcPr>
+            <w:tcW w:type="dxa" w:w="3135"/>
+          </w:tcPr>
+          <w:p>
+            <w:r>
+              <w:t>Database user</w:t>
+            </w:r>
+          </w:p>
+        </w:tc>
+      </w:tr>
+      <w:tr>
+        <w:tc>
+          <w:tcPr>
+            <w:tcW w:type="dxa" w:w="3135"/>
+          </w:tcPr>
+          <w:p>
+            <w:r>
+              <w:t>MYSQLPASSWORD</w:t>
+            </w:r>
+          </w:p>
+        </w:tc>
+        <w:tc>
+          <w:tcPr>
+            <w:tcW w:type="dxa" w:w="3135"/>
+          </w:tcPr>
+          <w:p>
+            <w:r>
+              <w:t>Auto-set by Railway MySQL plugin</w:t>
+            </w:r>
+          </w:p>
+        </w:tc>
+        <w:tc>
+          <w:tcPr>
+            <w:tcW w:type="dxa" w:w="3135"/>
+          </w:tcPr>
+          <w:p>
+            <w:r>
+              <w:t>Database password</w:t>
+            </w:r>
+          </w:p>
+        </w:tc>
+      </w:tr>
+      <w:tr>
+        <w:tc>
+          <w:tcPr>
+            <w:tcW w:type="dxa" w:w="3135"/>
+          </w:tcPr>
+          <w:p>
+            <w:r>
+              <w:t>MYSQL_DATABASE</w:t>
+            </w:r>
+          </w:p>
+        </w:tc>
+        <w:tc>
+          <w:tcPr>
+            <w:tcW w:type="dxa" w:w="3135"/>
+          </w:tcPr>
+          <w:p>
+            <w:r>
+              <w:t>Auto-set by Railway MySQL plugin</w:t>
+            </w:r>
+          </w:p>
+        </w:tc>
+        <w:tc>
+          <w:tcPr>
+            <w:tcW w:type="dxa" w:w="3135"/>
+          </w:tcPr>
+          <w:p>
+            <w:r>
+              <w:t>Database name</w:t>
+            </w:r>
+          </w:p>
+        </w:tc>
+      </w:tr>
+      <w:tr>
+        <w:tc>
+          <w:tcPr>
+            <w:tcW w:type="dxa" w:w="3135"/>
+          </w:tcPr>
+          <w:p>
+            <w:r>
+              <w:t>ADMIN_SECRET</w:t>
+            </w:r>
+          </w:p>
+        </w:tc>
+        <w:tc>
+          <w:tcPr>
+            <w:tcW w:type="dxa" w:w="3135"/>
+          </w:tcPr>
+          <w:p>
+            <w:r>
+              <w:t>Set manually — any strong string</w:t>
+            </w:r>
+          </w:p>
+        </w:tc>
+        <w:tc>
+          <w:tcPr>
+            <w:tcW w:type="dxa" w:w="3135"/>
+          </w:tcPr>
+          <w:p>
+            <w:r>
+              <w:t>Login password for /admin/login. Leave blank to disable auth in dev.</w:t>
+            </w:r>
+          </w:p>
+        </w:tc>
+      </w:tr>
+      <w:tr>
+        <w:tc>
+          <w:tcPr>
+            <w:tcW w:type="dxa" w:w="3135"/>
+          </w:tcPr>
+          <w:p>
+            <w:r>
+              <w:t>FLASK_SECRET_KEY</w:t>
+            </w:r>
+          </w:p>
+        </w:tc>
+        <w:tc>
+          <w:tcPr>
+            <w:tcW w:type="dxa" w:w="3135"/>
+          </w:tcPr>
+          <w:p>
+            <w:r>
+              <w:t>Set manually — 64-char hex string</w:t>
+            </w:r>
+          </w:p>
+        </w:tc>
+        <w:tc>
+          <w:tcPr>
+            <w:tcW w:type="dxa" w:w="3135"/>
+          </w:tcPr>
+          <w:p>
+            <w:r>
+              <w:t>Signs session cookies. Must be stable. Generate: python -c "import secrets; print(secrets.token_hex(32))"</w:t>
+            </w:r>
+          </w:p>
+        </w:tc>
+      </w:tr>
+      <w:tr>
+        <w:tc>
+          <w:tcPr>
+            <w:tcW w:type="dxa" w:w="3135"/>
+          </w:tcPr>
+          <w:p>
+            <w:r>
+              <w:t>REDDIT_CLIENT_ID</w:t>
+            </w:r>
+          </w:p>
+        </w:tc>
+        <w:tc>
+          <w:tcPr>
+            <w:tcW w:type="dxa" w:w="3135"/>
+          </w:tcPr>
+          <w:p>
+            <w:r>
+              <w:t>Optional</w:t>
+            </w:r>
+          </w:p>
+        </w:tc>
+        <w:tc>
+          <w:tcPr>
+            <w:tcW w:type="dxa" w:w="3135"/>
+          </w:tcPr>
+          <w:p>
+            <w:r>
+              <w:t>Reddit API key for sentiment scoring</w:t>
+            </w:r>
+          </w:p>
+        </w:tc>
+      </w:tr>
+      <w:tr>
+        <w:tc>
+          <w:tcPr>
+            <w:tcW w:type="dxa" w:w="3135"/>
+          </w:tcPr>
+          <w:p>
+            <w:r>
+              <w:t>REDDIT_CLIENT_SECRET</w:t>
+            </w:r>
+          </w:p>
+        </w:tc>
+        <w:tc>
+          <w:tcPr>
+            <w:tcW w:type="dxa" w:w="3135"/>
+          </w:tcPr>
+          <w:p>
+            <w:r>
+              <w:t>Optional</w:t>
+            </w:r>
+          </w:p>
+        </w:tc>
+        <w:tc>
+          <w:tcPr>
+            <w:tcW w:type="dxa" w:w="3135"/>
+          </w:tcPr>
+          <w:p>
+            <w:r>
+              <w:t>Reddit API secret for sentiment scoring</w:t>
+            </w:r>
+          </w:p>
+        </w:tc>
+      </w:tr>
+    </w:tbl>
+    <w:p>
+      <w:r>
+        <w:rPr>
+          <w:b/>
+        </w:rPr>
+        <w:t>Health Check  (Railway → Service → Settings)</w:t>
+      </w:r>
+    </w:p>
+    <w:p>
+      <w:r>
+        <w:rPr>
+          <w:rFonts w:ascii="Courier New" w:hAnsi="Courier New"/>
+          <w:b w:val="0"/>
+          <w:sz w:val="18"/>
+        </w:rPr>
+        <w:t>Healthcheck Path: /health</w:t>
+        <w:br/>
+        <w:t>Healthcheck Timeout: 600 seconds</w:t>
+      </w:r>
+    </w:p>
+    <w:p>
+      <w:r>
+        <w:rPr>
+          <w:b w:val="0"/>
+        </w:rPr>
+        <w:t>Ensures Railway waits for full startup (DB connection + data load + backfill threads) before marking a deploy complete. Returns 200 when healthy, 503 when degraded.</w:t>
+      </w:r>
+    </w:p>
+    <w:p>
+      <w:r>
+        <w:rPr>
+          <w:b/>
+        </w:rPr>
+        <w:t>Restart Policy  (Railway → Service → Settings)</w:t>
+      </w:r>
+    </w:p>
+    <w:p>
+      <w:r>
+        <w:rPr>
+          <w:rFonts w:ascii="Courier New" w:hAnsi="Courier New"/>
+          <w:b w:val="0"/>
+          <w:sz w:val="18"/>
+        </w:rPr>
+        <w:t>Policy: On Failure    Retry count: 5</w:t>
+      </w:r>
+    </w:p>
+    <w:p>
+      <w:r>
+        <w:rPr>
+          <w:b w:val="0"/>
+        </w:rPr>
+        <w:t>Covers process crashes and OOM kills. Silent thread death is handled by UptimeRobot polling /health every 5 minutes (Section 4.4).</w:t>
+      </w:r>
+    </w:p>
+    <w:p>
+      <w:r>
+        <w:rPr>
+          <w:b w:val="0"/>
+        </w:rPr>
+        <w:t>Serverless: OFF — keep disabled. If ON, the container sleeps between requests, killing background price refresh threads.</w:t>
+      </w:r>
+    </w:p>
+    <w:p>
+      <w:r>
+        <w:rPr>
+          <w:b/>
+        </w:rPr>
+        <w:t>Deploying a Code Update</w:t>
+      </w:r>
+    </w:p>
+    <w:p>
+      <w:r>
+        <w:rPr>
+          <w:rFonts w:ascii="Courier New" w:hAnsi="Courier New"/>
+          <w:b w:val="0"/>
+          <w:sz w:val="18"/>
+        </w:rPr>
+        <w:t>git add -A</w:t>
+        <w:br/>
+        <w:t>git commit -m "description"</w:t>
+        <w:br/>
+        <w:t>git push origin main</w:t>
+      </w:r>
+    </w:p>
+    <w:p>
+      <w:r>
+        <w:rPr>
+          <w:b w:val="0"/>
+        </w:rPr>
+        <w:t>Railway auto-deploys on push. Build time: ~1 min for code-only changes (pip cache hit), ~2-3 min when requirements.txt changes (full pip install). Traffic switches only after /health returns 200.</w:t>
+      </w:r>
+    </w:p>
+    <w:p>
+      <w:r>
+        <w:rPr>
+          <w:b/>
+        </w:rPr>
+        <w:t>Viewing Logs</w:t>
+      </w:r>
+    </w:p>
+    <w:p>
+      <w:r>
+        <w:rPr>
+          <w:b w:val="0"/>
+        </w:rPr>
+        <w:t>Railway → Service → Deployments → active deployment → Logs. Useful filter prefixes: [refresh], [reco], [auth], [hist-backfill], [vol-trades], [intraday].</w:t>
+      </w:r>
+    </w:p>
+    <w:p>
+      <w:r>
+        <w:rPr>
+          <w:b/>
+        </w:rPr>
+        <w:t>Taking a Backup</w:t>
+      </w:r>
+    </w:p>
+    <w:p>
+      <w:r>
+        <w:rPr>
+          <w:b w:val="0"/>
+        </w:rPr>
+        <w:t>SSH is not available on Railway. Two options:</w:t>
+        <w:br/>
+        <w:t>1. Point your local .env at the Railway database (copy MYSQLHOST, MYSQLUSER etc. from Railway env vars) then run: python backup.py</w:t>
+        <w:br/>
+        <w:t>2. Use Railway MySQL plugin Data panel to export directly.</w:t>
+      </w:r>
+    </w:p>
     <w:p>
       <w:pPr>
         <w:keepNext/>

</xml_diff>